<commit_message>
Phase 24 — Herd → Animals: Groups, Transfers, Archived Status
</commit_message>
<xml_diff>
--- a/Z docx file/Folder Data.docx
+++ b/Z docx file/Folder Data.docx
@@ -954,18 +954,6 @@
     </w:p>
     <w:p>
       <w:pPr>
-        <w:spacing w:before="100" w:beforeAutospacing="1" w:after="0" w:line="240" w:lineRule="auto"/>
-        <w:ind w:left="720"/>
-        <w:rPr>
-          <w:rFonts w:asciiTheme="majorBidi" w:eastAsia="Times New Roman" w:hAnsiTheme="majorBidi" w:cstheme="majorBidi"/>
-          <w:color w:val="1F1F1F"/>
-          <w:sz w:val="24"/>
-          <w:szCs w:val="24"/>
-        </w:rPr>
-      </w:pPr>
-    </w:p>
-    <w:p>
-      <w:pPr>
         <w:numPr>
           <w:ilvl w:val="0"/>
           <w:numId w:val="1"/>
@@ -1062,18 +1050,8 @@
         </w:rPr>
         <w:t>:</w:t>
       </w:r>
-    </w:p>
-    <w:p>
-      <w:pPr>
-        <w:spacing w:before="100" w:beforeAutospacing="1" w:after="0" w:line="240" w:lineRule="auto"/>
-        <w:ind w:left="720"/>
-        <w:rPr>
-          <w:rFonts w:asciiTheme="majorBidi" w:eastAsia="Times New Roman" w:hAnsiTheme="majorBidi" w:cstheme="majorBidi"/>
-          <w:color w:val="1F1F1F"/>
-          <w:sz w:val="24"/>
-          <w:szCs w:val="24"/>
-        </w:rPr>
-      </w:pPr>
+      <w:bookmarkStart w:id="0" w:name="_GoBack"/>
+      <w:bookmarkEnd w:id="0"/>
       <w:r>
         <w:rPr>
           <w:rFonts w:asciiTheme="majorBidi" w:eastAsia="Times New Roman" w:hAnsiTheme="majorBidi" w:cstheme="majorBidi"/>
@@ -2248,7 +2226,6 @@
           <w:cs/>
           <w:lang w:bidi="bn-IN"/>
         </w:rPr>
-        <w:lastRenderedPageBreak/>
         <w:t>কাজ</w:t>
       </w:r>
       <w:r>
@@ -2477,6 +2454,7 @@
           <w:cs/>
           <w:lang w:bidi="bn-IN"/>
         </w:rPr>
+        <w:lastRenderedPageBreak/>
         <w:t>ভিতরে</w:t>
       </w:r>
       <w:r>
@@ -4195,7 +4173,6 @@
           <w:szCs w:val="23"/>
           <w:bdr w:val="none" w:sz="0" w:space="0" w:color="auto" w:frame="1"/>
         </w:rPr>
-        <w:lastRenderedPageBreak/>
         <w:t>constants/</w:t>
       </w:r>
       <w:r>
@@ -4575,6 +4552,7 @@
           <w:cs/>
           <w:lang w:bidi="bn-IN"/>
         </w:rPr>
+        <w:lastRenderedPageBreak/>
         <w:t>৫</w:t>
       </w:r>
       <w:r>
@@ -6527,6 +6505,7 @@
           <w:sz w:val="24"/>
           <w:szCs w:val="24"/>
         </w:rPr>
+        <w:lastRenderedPageBreak/>
         <w:br/>
       </w:r>
     </w:p>
@@ -8588,6 +8567,7 @@
           <w:cs/>
           <w:lang w:bidi="bn-IN"/>
         </w:rPr>
+        <w:lastRenderedPageBreak/>
         <w:t>অন্যান্য</w:t>
       </w:r>
       <w:r>
@@ -10588,7 +10568,6 @@
           <w:cs/>
           <w:lang w:bidi="bn-IN"/>
         </w:rPr>
-        <w:lastRenderedPageBreak/>
         <w:t>কাজ</w:t>
       </w:r>
       <w:r>
@@ -11585,8 +11564,6 @@
         </w:rPr>
         <w:t>:</w:t>
       </w:r>
-      <w:bookmarkStart w:id="0" w:name="_GoBack"/>
-      <w:bookmarkEnd w:id="0"/>
     </w:p>
     <w:p>
       <w:pPr>

</xml_diff>